<commit_message>
docs: aplicar correcciones del docente al 1.5, la PPT y el README
</commit_message>
<xml_diff>
--- a/Fase 1/Evidencias Grupales/1.5_GuiaEstudiante_Fase 1_Definicion Proyecto APT (Español).docx
+++ b/Fase 1/Evidencias Grupales/1.5_GuiaEstudiante_Fase 1_Definicion Proyecto APT (Español).docx
@@ -1495,34 +1495,26 @@
                 <w:sz w:val="20"/>
                 <w:szCs w:val="20"/>
               </w:rPr>
-              <w:t>EmotionLAB</w:t>
+              <w:t>EmotionLAB VR es un proyecto de continuidad: existe una versión previa de EmotionLAB orientada a estudiantes de educación superior, y esta fase la reorienta a estudiantes de Enseñanza Media, incorporando gamificación en la experiencia. El proyecto aborda el déficit de gestión emocional que presentan los adolescentes frente a situaciones de alta exigencia, como una exposición oral o una entrevista. A ello se suma que el docente o psicopedagogo que acompaña el proceso no dispone de datos comportamentales que le permitan identificar quién necesita apoyo y en qué momento.</w:t>
             </w:r>
             <w:proofErr w:type="spellEnd"/>
-            <w:r>
+          </w:p>
+          <w:p>
+            <w:pPr>
+              <w:jc w:val="both"/>
               <w:rPr>
                 <w:color w:val="548DD4"/>
                 <w:sz w:val="20"/>
                 <w:szCs w:val="20"/>
               </w:rPr>
-              <w:t xml:space="preserve"> VR busca resolver la dificultad que presentan los establecimientos educativos para medir e interpretar de forma objetiva las respuestas emocionales y de atención en estudiantes de Enseñanza Media durante sus procesos formativos. Tradicionalmente, los colegios dependen de observaciones subjetivas o encuestas manuales que no logran capturar la experiencia real del estudiante en tiempo real. </w:t>
-            </w:r>
-          </w:p>
-          <w:p>
-            <w:pPr>
-              <w:jc w:val="both"/>
+            </w:pPr>
+            <w:r>
               <w:rPr>
                 <w:color w:val="548DD4"/>
                 <w:sz w:val="20"/>
                 <w:szCs w:val="20"/>
               </w:rPr>
-            </w:pPr>
-            <w:r>
-              <w:rPr>
-                <w:color w:val="548DD4"/>
-                <w:sz w:val="20"/>
-                <w:szCs w:val="20"/>
-              </w:rPr>
-              <w:t xml:space="preserve">El proyecto se situará en la comuna de Viña del Mar, interviniendo directamente en un colegio local con una muestra representativa de al menos 20 estudiantes de Enseñanza Media. La problemática es altamente relevante para la informática moderna, pues combina el uso de tecnología emergente (Realidad Virtual) con la estructuración, captura y procesamiento de datos para la toma de decisiones pedagógicas respaldadas por información tangible. </w:t>
+              <w:t>El proyecto se situará en la comuna de Viña del Mar, interviniendo directamente en un colegio local con una muestra representativa de al menos 20 estudiantes de Enseñanza Media. La problemática es altamente relevante para la informática moderna, pues combina el uso de tecnología emergente (Realidad Virtual) con la captura, estructuración y transmisión de datos comportamentales que apoyan la toma de decisiones del docente o psicopedagogo con información tangible.</w:t>
             </w:r>
           </w:p>
         </w:tc>
@@ -1570,62 +1562,14 @@
                 <w:sz w:val="20"/>
                 <w:szCs w:val="20"/>
               </w:rPr>
-              <w:t xml:space="preserve">El objetivo del proyecto es diseñar e implementar un sistema inmersivo en Realidad Virtual que recopile métricas de comportamiento y respuesta socioemocional de estudiantes durante sesiones de simulación. La solución contempla la creación de una arquitectura de datos capaz de </w:t>
+              <w:t>Somos el equipo de desarrollo y diseño de la aplicación. Diseñamos e implementamos una experiencia inmersiva en Realidad Virtual que sitúa al estudiante en una situación de exposición o entrevista, incorporando un ejercicio de respiración guiada antes de exponer y un cierre gamificado de recolección de objetos en una sala acogedora. Somos además las encargadas de la telemetría: la captura de los datos comportamentales registrados durante el recorrido y su transmisión hacia la nube mediante API. La solución contempla una arquitectura de datos capaz de recepcionar, almacenar y limpiar la información capturada durante intervenciones realizadas dos veces por semana durante un mes. Finalmente, estos datos son transmitidos al equipo de IA de EmotionLab, encargado del modelo de clasificación y del dashboard analítico de Inteligencia de Negocios que apoya la toma de decisiones del docente o psicopedagogo.</w:t>
             </w:r>
             <w:proofErr w:type="spellStart"/>
-            <w:r>
-              <w:rPr>
-                <w:color w:val="548DD4"/>
-                <w:sz w:val="20"/>
-                <w:szCs w:val="20"/>
-              </w:rPr>
-              <w:t>recepcionar</w:t>
-            </w:r>
             <w:proofErr w:type="spellEnd"/>
-            <w:r>
-              <w:rPr>
-                <w:color w:val="548DD4"/>
-                <w:sz w:val="20"/>
-                <w:szCs w:val="20"/>
-              </w:rPr>
-              <w:t xml:space="preserve">, almacenar y limpiar la información capturada durante intervenciones realizadas dos veces por semana durante un mes. Finalmente, estos datos serán transmitidos al equipo de IA de </w:t>
-            </w:r>
             <w:proofErr w:type="spellStart"/>
-            <w:r>
-              <w:rPr>
-                <w:color w:val="548DD4"/>
-                <w:sz w:val="20"/>
-                <w:szCs w:val="20"/>
-              </w:rPr>
-              <w:t>EmotionLab</w:t>
-            </w:r>
             <w:proofErr w:type="spellEnd"/>
-            <w:r>
-              <w:rPr>
-                <w:color w:val="548DD4"/>
-                <w:sz w:val="20"/>
-                <w:szCs w:val="20"/>
-              </w:rPr>
-              <w:t xml:space="preserve"> encargado del </w:t>
-            </w:r>
             <w:proofErr w:type="spellStart"/>
-            <w:r>
-              <w:rPr>
-                <w:color w:val="548DD4"/>
-                <w:sz w:val="20"/>
-                <w:szCs w:val="20"/>
-              </w:rPr>
-              <w:t>dashboard</w:t>
-            </w:r>
             <w:proofErr w:type="spellEnd"/>
-            <w:r>
-              <w:rPr>
-                <w:color w:val="548DD4"/>
-                <w:sz w:val="20"/>
-                <w:szCs w:val="20"/>
-              </w:rPr>
-              <w:t xml:space="preserve"> analítico de Inteligencia de Negocios</w:t>
-            </w:r>
           </w:p>
         </w:tc>
       </w:tr>
@@ -1686,7 +1630,7 @@
                 <w:sz w:val="20"/>
                 <w:szCs w:val="20"/>
               </w:rPr>
-              <w:t xml:space="preserve"> Diseño e implementación de la arquitectura de almacenamiento para datos procesados desde visores VR.</w:t>
+              <w:t xml:space="preserve"> Diseño e implementación de la arquitectura de almacenamiento en la nube (AWS, Lambda y Terraform) para los datos comportamentales capturados desde los visores VR.</w:t>
             </w:r>
           </w:p>
           <w:p>
@@ -1709,29 +1653,9 @@
                 <w:sz w:val="20"/>
                 <w:szCs w:val="20"/>
               </w:rPr>
-              <w:t xml:space="preserve">Análisis y Minería de Datos: Estructuración y preparación de los datos capturados para su posterior análisis por el equipo de </w:t>
+              <w:t>Análisis y Minería de Datos: Estructuración y preparación de los datos comportamentales capturados para su posterior análisis y clasificación por el equipo de IA.</w:t>
             </w:r>
             <w:proofErr w:type="gramStart"/>
-            <w:r>
-              <w:rPr>
-                <w:rFonts w:ascii="Arial" w:eastAsia="Arial" w:hAnsi="Arial" w:cs="Arial"/>
-                <w:b/>
-                <w:bCs/>
-                <w:color w:val="548DD4"/>
-                <w:sz w:val="20"/>
-                <w:szCs w:val="20"/>
-              </w:rPr>
-              <w:t>IA.</w:t>
-            </w:r>
-            <w:r>
-              <w:rPr>
-                <w:rFonts w:ascii="Arial" w:eastAsia="Arial" w:hAnsi="Arial" w:cs="Arial"/>
-                <w:color w:val="548DD4"/>
-                <w:sz w:val="20"/>
-                <w:szCs w:val="20"/>
-              </w:rPr>
-              <w:t>.</w:t>
-            </w:r>
             <w:proofErr w:type="gramEnd"/>
           </w:p>
           <w:p>
@@ -1861,18 +1785,9 @@
                 <w:sz w:val="20"/>
                 <w:szCs w:val="20"/>
               </w:rPr>
-              <w:t>El proyecto es totalmente factible de ejecutar dentro del marco de 13 semanas (4 semanas de planificación/documentación y 9 semanas de desarrollo, pruebas de campo y cierre), dejando además un margen de 5 semanas dentro del periodo de 18 semanas del semestre académico</w:t>
+              <w:t>El proyecto es totalmente factible de ejecutar dentro del marco de 13 semanas (4 semanas de planificación/documentación y 9 semanas de desarrollo, pruebas de campo y cierre), dejando además un margen de 5 semanas dentro del periodo de 18 semanas del semestre académico. Al tratarse de un proyecto de continuidad, se parte desde una versión previa de EmotionLAB ya desarrollada, lo que reduce el riesgo técnico y permite concentrar el esfuerzo en el rediseño de la experiencia para Enseñanza Media y en la telemetría.</w:t>
             </w:r>
             <w:proofErr w:type="gramStart"/>
-            <w:r>
-              <w:rPr>
-                <w:rFonts w:ascii="Arial" w:eastAsia="Arial" w:hAnsi="Arial" w:cs="Arial"/>
-                <w:color w:val="548DD4"/>
-                <w:sz w:val="20"/>
-                <w:szCs w:val="20"/>
-              </w:rPr>
-              <w:t>. .</w:t>
-            </w:r>
             <w:proofErr w:type="gramEnd"/>
           </w:p>
           <w:p>
@@ -1906,7 +1821,7 @@
                 <w:sz w:val="20"/>
                 <w:szCs w:val="20"/>
               </w:rPr>
-              <w:t xml:space="preserve"> Equipos computacionales personales, visores VR y motores de bases de datos/herramientas de BI de uso académico accesible.</w:t>
+              <w:t xml:space="preserve"> Equipos computacionales personales, visores Meta Quest, Unity para el desarrollo de la experiencia y servicios en la nube de AWS (Lambda y Terraform) de uso académico accesible.</w:t>
             </w:r>
           </w:p>
           <w:p>
@@ -1975,7 +1890,7 @@
                 <w:sz w:val="20"/>
                 <w:szCs w:val="20"/>
               </w:rPr>
-              <w:t xml:space="preserve"> Dado que se trabaja con estudiantes de Enseñanza Media (menores de edad), existe un riesgo asociado a la protección de datos. Esto se mitigará aplicando protocolos de anonimización estricta de datos, cifrado de la información y uso de consentimientos informados firmados por los apoderados.</w:t>
+              <w:t xml:space="preserve"> Dado que se trabaja con estudiantes adolescentes de Enseñanza Media, existe un riesgo asociado a la protección de datos. Esto se mitigará aplicando protocolos de anonimización estricta de datos, cifrado de la información y uso de consentimientos informados firmados por los apoderados.</w:t>
             </w:r>
           </w:p>
         </w:tc>
@@ -2189,7 +2104,7 @@
                 <w:sz w:val="20"/>
                 <w:szCs w:val="20"/>
               </w:rPr>
-              <w:t xml:space="preserve">Proporcionar a los establecimientos educacionales un sistema analítico basado en Realidad Virtual y gestión de datos que permita medir y evaluar los niveles de respuesta emocional y cognitiva en estudiantes de Enseñanza Media durante el segundo semestre de 2026. </w:t>
+              <w:t>Diseñar y desarrollar una experiencia de Realidad Virtual para la regulación emocional de estudiantes de Enseñanza Media frente a situaciones de exposición o entrevista, junto con la arquitectura de telemetría que captura y transmite los datos comportamentales al equipo de IA, encargado de clasificarlos y generar los insights que apoyan la toma de decisiones del docente o psicopedagogo, durante el segundo semestre de 2026.</w:t>
             </w:r>
           </w:p>
         </w:tc>
@@ -2244,7 +2159,7 @@
                 <w:sz w:val="20"/>
                 <w:szCs w:val="20"/>
               </w:rPr>
-              <w:t>Diseñar un entorno inmersivo en Realidad Virtual que recolecte datos de respuesta y tiempo de interacción en estudiantes de Enseñanza Media.</w:t>
+              <w:t>Diseñar la experiencia inmersiva en Realidad Virtual para estudiantes de Enseñanza Media, incluyendo sus escenarios, el ejercicio de respiración guiada y el cierre gamificado.</w:t>
             </w:r>
           </w:p>
           <w:p>
@@ -2269,7 +2184,7 @@
                 <w:sz w:val="20"/>
                 <w:szCs w:val="20"/>
               </w:rPr>
-              <w:t>Construir una arquitectura de base de datos segura e integrarla para el almacenamiento de los registros capturados durante las experiencias inmersivas.</w:t>
+              <w:t>Construir la arquitectura de telemetría que captura los datos comportamentales del recorrido y los transmite mediante API hacia la nube para su almacenamiento seguro.</w:t>
             </w:r>
           </w:p>
           <w:p>
@@ -2318,15 +2233,7 @@
                 <w:sz w:val="20"/>
                 <w:szCs w:val="20"/>
               </w:rPr>
-              <w:t>Proteger la privacidad de los datos mediante técnicas de anonimización y cumplimiento de las normativas vigentes sobre información confidencial de menores.</w:t>
-            </w:r>
-            <w:r>
-              <w:rPr>
-                <w:color w:val="548DD4"/>
-                <w:sz w:val="20"/>
-                <w:szCs w:val="20"/>
-              </w:rPr>
-              <w:t xml:space="preserve"> </w:t>
+              <w:t>Proteger la privacidad de los datos mediante técnicas de anonimización y cumplimiento de las normativas vigentes sobre información confidencial de estudiantes adolescentes.</w:t>
             </w:r>
           </w:p>
         </w:tc>
@@ -2907,6 +2814,30 @@
               <w:t xml:space="preserve"> del proyecto mediante GitHub.</w:t>
             </w:r>
           </w:p>
+          <w:p>
+            <w:pPr>
+              <w:jc w:val="both"/>
+              <w:rPr>
+                <w:i/>
+                <w:iCs/>
+                <w:color w:val="548DD4"/>
+                <w:sz w:val="20"/>
+                <w:szCs w:val="20"/>
+              </w:rPr>
+            </w:pPr>
+            <w:r>
+              <w:rPr>
+                <w:i/>
+                <w:iCs/>
+                <w:color w:val="548DD4"/>
+                <w:sz w:val="20"/>
+                <w:szCs w:val="20"/>
+              </w:rPr>
+              <w:t>El stack de trabajo contempla Unity para el desarrollo de la experiencia inmersiva, visores Meta Quest como hardware objetivo, AWS con Lambda y Terraform para la infraestructura y la transmisión de datos en la nube, y GitHub junto a GitHub Projects para el versionamiento del código y la gestión del tablero Kanban.</w:t>
+            </w:r>
+            <w:proofErr w:type="spellStart"/>
+            <w:proofErr w:type="spellEnd"/>
+          </w:p>
         </w:tc>
       </w:tr>
     </w:tbl>
@@ -4030,6 +3961,300 @@
                 <w:bCs/>
                 <w:color w:val="1F3864"/>
               </w:rPr>
+              <w:t>Avance</w:t>
+            </w:r>
+          </w:p>
+        </w:tc>
+        <w:tc>
+          <w:tcPr>
+            <w:tcW w:w="1843" w:type="dxa"/>
+          </w:tcPr>
+          <w:p>
+            <w:pPr>
+              <w:pBdr>
+                <w:top w:val="nil"/>
+                <w:left w:val="nil"/>
+                <w:bottom w:val="nil"/>
+                <w:right w:val="nil"/>
+                <w:between w:val="nil"/>
+              </w:pBdr>
+              <w:tabs>
+                <w:tab w:val="center" w:pos="4419"/>
+                <w:tab w:val="right" w:pos="8838"/>
+              </w:tabs>
+              <w:spacing w:after="0" w:line="240" w:lineRule="auto"/>
+              <w:jc w:val="both"/>
+              <w:rPr>
+                <w:b/>
+                <w:bCs/>
+                <w:color w:val="1F3864"/>
+              </w:rPr>
+            </w:pPr>
+            <w:r>
+              <w:rPr>
+                <w:b/>
+                <w:bCs/>
+                <w:color w:val="1F3864"/>
+              </w:rPr>
+              <w:t>Diseño de la experiencia VR</w:t>
+            </w:r>
+            <w:proofErr w:type="spellStart"/>
+            <w:proofErr w:type="spellEnd"/>
+          </w:p>
+        </w:tc>
+        <w:tc>
+          <w:tcPr>
+            <w:tcW w:w="3825" w:type="dxa"/>
+          </w:tcPr>
+          <w:p>
+            <w:pPr>
+              <w:pBdr>
+                <w:top w:val="nil"/>
+                <w:left w:val="nil"/>
+                <w:bottom w:val="nil"/>
+                <w:right w:val="nil"/>
+                <w:between w:val="nil"/>
+              </w:pBdr>
+              <w:tabs>
+                <w:tab w:val="center" w:pos="4419"/>
+                <w:tab w:val="right" w:pos="8838"/>
+              </w:tabs>
+              <w:spacing w:after="0" w:line="240" w:lineRule="auto"/>
+              <w:jc w:val="both"/>
+              <w:rPr>
+                <w:b/>
+                <w:bCs/>
+                <w:color w:val="1F3864"/>
+              </w:rPr>
+            </w:pPr>
+            <w:r>
+              <w:rPr>
+                <w:b/>
+                <w:bCs/>
+                <w:color w:val="1F3864"/>
+              </w:rPr>
+              <w:t>Documento de diseño con los escenarios, el recorrido, la respiración guiada, el cierre gamificado y la identidad visual definidos.</w:t>
+            </w:r>
+          </w:p>
+        </w:tc>
+        <w:tc>
+          <w:tcPr>
+            <w:tcW w:w="2551" w:type="dxa"/>
+          </w:tcPr>
+          <w:p>
+            <w:pPr>
+              <w:pBdr>
+                <w:top w:val="nil"/>
+                <w:left w:val="nil"/>
+                <w:bottom w:val="nil"/>
+                <w:right w:val="nil"/>
+                <w:between w:val="nil"/>
+              </w:pBdr>
+              <w:tabs>
+                <w:tab w:val="center" w:pos="4419"/>
+                <w:tab w:val="right" w:pos="8838"/>
+              </w:tabs>
+              <w:spacing w:after="0" w:line="240" w:lineRule="auto"/>
+              <w:jc w:val="both"/>
+              <w:rPr>
+                <w:b/>
+                <w:bCs/>
+                <w:color w:val="1F3864"/>
+              </w:rPr>
+            </w:pPr>
+            <w:r>
+              <w:rPr>
+                <w:b/>
+                <w:bCs/>
+                <w:color w:val="1F3864"/>
+              </w:rPr>
+              <w:t>Es el hito que evidencia el trabajo de diseño y desarrollo de la experiencia, alcance principal del equipo.</w:t>
+            </w:r>
+          </w:p>
+        </w:tc>
+      </w:tr>
+      <w:tr>
+        <w:trPr>
+          <w:trHeight w:val="362"/>
+        </w:trPr>
+        <w:tc>
+          <w:tcPr>
+            <w:tcW w:w="1843" w:type="dxa"/>
+          </w:tcPr>
+          <w:p>
+            <w:pPr>
+              <w:pBdr>
+                <w:top w:val="nil"/>
+                <w:left w:val="nil"/>
+                <w:bottom w:val="nil"/>
+                <w:right w:val="nil"/>
+                <w:between w:val="nil"/>
+              </w:pBdr>
+              <w:tabs>
+                <w:tab w:val="center" w:pos="4419"/>
+                <w:tab w:val="right" w:pos="8838"/>
+              </w:tabs>
+              <w:spacing w:after="0" w:line="240" w:lineRule="auto"/>
+              <w:jc w:val="both"/>
+              <w:rPr>
+                <w:b/>
+                <w:bCs/>
+                <w:color w:val="1F3864"/>
+              </w:rPr>
+            </w:pPr>
+            <w:r>
+              <w:rPr>
+                <w:b/>
+                <w:bCs/>
+                <w:color w:val="1F3864"/>
+              </w:rPr>
+              <w:t>Avance</w:t>
+            </w:r>
+          </w:p>
+        </w:tc>
+        <w:tc>
+          <w:tcPr>
+            <w:tcW w:w="1843" w:type="dxa"/>
+          </w:tcPr>
+          <w:p>
+            <w:pPr>
+              <w:pBdr>
+                <w:top w:val="nil"/>
+                <w:left w:val="nil"/>
+                <w:bottom w:val="nil"/>
+                <w:right w:val="nil"/>
+                <w:between w:val="nil"/>
+              </w:pBdr>
+              <w:tabs>
+                <w:tab w:val="center" w:pos="4419"/>
+                <w:tab w:val="right" w:pos="8838"/>
+              </w:tabs>
+              <w:spacing w:after="0" w:line="240" w:lineRule="auto"/>
+              <w:jc w:val="both"/>
+              <w:rPr>
+                <w:b/>
+                <w:bCs/>
+                <w:color w:val="1F3864"/>
+              </w:rPr>
+            </w:pPr>
+            <w:r>
+              <w:rPr>
+                <w:b/>
+                <w:bCs/>
+                <w:color w:val="1F3864"/>
+              </w:rPr>
+              <w:t>Servicios en AWS operativos</w:t>
+            </w:r>
+            <w:proofErr w:type="spellStart"/>
+            <w:proofErr w:type="spellEnd"/>
+          </w:p>
+        </w:tc>
+        <w:tc>
+          <w:tcPr>
+            <w:tcW w:w="3825" w:type="dxa"/>
+          </w:tcPr>
+          <w:p>
+            <w:pPr>
+              <w:pBdr>
+                <w:top w:val="nil"/>
+                <w:left w:val="nil"/>
+                <w:bottom w:val="nil"/>
+                <w:right w:val="nil"/>
+                <w:between w:val="nil"/>
+              </w:pBdr>
+              <w:tabs>
+                <w:tab w:val="center" w:pos="4419"/>
+                <w:tab w:val="right" w:pos="8838"/>
+              </w:tabs>
+              <w:spacing w:after="0" w:line="240" w:lineRule="auto"/>
+              <w:jc w:val="both"/>
+              <w:rPr>
+                <w:b/>
+                <w:bCs/>
+                <w:color w:val="1F3864"/>
+              </w:rPr>
+            </w:pPr>
+            <w:r>
+              <w:rPr>
+                <w:b/>
+                <w:bCs/>
+                <w:color w:val="1F3864"/>
+              </w:rPr>
+              <w:t>Cuentas, servicios e infraestructura en la nube (Lambda y Terraform) desplegados y con la API de transmisión funcionando.</w:t>
+            </w:r>
+          </w:p>
+        </w:tc>
+        <w:tc>
+          <w:tcPr>
+            <w:tcW w:w="2551" w:type="dxa"/>
+          </w:tcPr>
+          <w:p>
+            <w:pPr>
+              <w:pBdr>
+                <w:top w:val="nil"/>
+                <w:left w:val="nil"/>
+                <w:bottom w:val="nil"/>
+                <w:right w:val="nil"/>
+                <w:between w:val="nil"/>
+              </w:pBdr>
+              <w:tabs>
+                <w:tab w:val="center" w:pos="4419"/>
+                <w:tab w:val="right" w:pos="8838"/>
+              </w:tabs>
+              <w:spacing w:after="0" w:line="240" w:lineRule="auto"/>
+              <w:jc w:val="both"/>
+              <w:rPr>
+                <w:b/>
+                <w:bCs/>
+                <w:color w:val="1F3864"/>
+              </w:rPr>
+            </w:pPr>
+            <w:r>
+              <w:rPr>
+                <w:b/>
+                <w:bCs/>
+                <w:color w:val="1F3864"/>
+              </w:rPr>
+              <w:t>Hito que demuestra que la arquitectura de telemetría está operativa y lista para el acoplamiento del equipo de IA.</w:t>
+            </w:r>
+          </w:p>
+        </w:tc>
+      </w:tr>
+      <w:tr>
+        <w:trPr>
+          <w:trHeight w:val="362"/>
+        </w:trPr>
+        <w:tc>
+          <w:tcPr>
+            <w:tcW w:w="1843" w:type="dxa"/>
+          </w:tcPr>
+          <w:p>
+            <w:pPr>
+              <w:pBdr>
+                <w:top w:val="nil"/>
+                <w:left w:val="nil"/>
+                <w:bottom w:val="nil"/>
+                <w:right w:val="nil"/>
+                <w:between w:val="nil"/>
+              </w:pBdr>
+              <w:tabs>
+                <w:tab w:val="center" w:pos="4419"/>
+                <w:tab w:val="right" w:pos="8838"/>
+              </w:tabs>
+              <w:spacing w:after="0" w:line="240" w:lineRule="auto"/>
+              <w:jc w:val="both"/>
+              <w:rPr>
+                <w:b/>
+                <w:bCs/>
+                <w:color w:val="1F3864"/>
+              </w:rPr>
+            </w:pPr>
+            <w:r>
+              <w:rPr>
+                <w:b/>
+                <w:bCs/>
+                <w:color w:val="1F3864"/>
+              </w:rPr>
               <w:t>Final</w:t>
             </w:r>
           </w:p>
@@ -5219,7 +5444,7 @@
                 <w:sz w:val="18"/>
                 <w:szCs w:val="18"/>
               </w:rPr>
-              <w:t>6 semanas</w:t>
+              <w:t>5 semanas</w:t>
             </w:r>
           </w:p>
         </w:tc>
@@ -5415,7 +5640,7 @@
                 <w:sz w:val="18"/>
                 <w:szCs w:val="18"/>
               </w:rPr>
-              <w:t>5 semanas</w:t>
+              <w:t>4 semanas</w:t>
             </w:r>
           </w:p>
         </w:tc>
@@ -5734,7 +5959,7 @@
                 <w:sz w:val="18"/>
                 <w:szCs w:val="18"/>
               </w:rPr>
-              <w:t>Elaborar y gestionar la firma de los consentimientos informados de los apoderados de los estudiantes participantes, menores de edad.</w:t>
+              <w:t>Elaborar y gestionar la firma de los consentimientos informados de los apoderados de los estudiantes adolescentes participantes.</w:t>
             </w:r>
           </w:p>
         </w:tc>
@@ -5973,7 +6198,7 @@
                 <w:sz w:val="18"/>
                 <w:szCs w:val="18"/>
               </w:rPr>
-              <w:t>4 semanas</w:t>
+              <w:t>3 semanas</w:t>
             </w:r>
           </w:p>
         </w:tc>
@@ -6131,7 +6356,7 @@
                 <w:sz w:val="18"/>
                 <w:szCs w:val="18"/>
               </w:rPr>
-              <w:t>Servidor AWS, API, credenciales de acceso</w:t>
+              <w:t>AWS (Lambda, Terraform), API, credenciales de acceso</w:t>
             </w:r>
           </w:p>
         </w:tc>
@@ -6159,7 +6384,7 @@
                 <w:sz w:val="18"/>
                 <w:szCs w:val="18"/>
               </w:rPr>
-              <w:t>3 semanas</w:t>
+              <w:t>2 semanas</w:t>
             </w:r>
           </w:p>
         </w:tc>
@@ -6345,7 +6570,7 @@
                 <w:sz w:val="18"/>
                 <w:szCs w:val="18"/>
               </w:rPr>
-              <w:t>3 semanas</w:t>
+              <w:t>2 semanas</w:t>
             </w:r>
           </w:p>
         </w:tc>

</xml_diff>

<commit_message>
docs: Mejora 1.5 - Se borraron páginas en blanco.
</commit_message>
<xml_diff>
--- a/Fase 1/Evidencias Grupales/1.5_GuiaEstudiante_Fase 1_Definicion Proyecto APT (Español).docx
+++ b/Fase 1/Evidencias Grupales/1.5_GuiaEstudiante_Fase 1_Definicion Proyecto APT (Español).docx
@@ -1495,9 +1495,35 @@
                 <w:sz w:val="20"/>
                 <w:szCs w:val="20"/>
               </w:rPr>
-              <w:t>EmotionLAB VR es un proyecto de continuidad: existe una versión previa de EmotionLAB orientada a estudiantes de educación superior, y esta fase la reorienta a estudiantes de Enseñanza Media, incorporando gamificación en la experiencia. El proyecto aborda el déficit de gestión emocional que presentan los adolescentes frente a situaciones de alta exigencia, como una exposición oral o una entrevista. A ello se suma que el docente o psicopedagogo que acompaña el proceso no dispone de datos comportamentales que le permitan identificar quién necesita apoyo y en qué momento.</w:t>
+              <w:t>EmotionLAB</w:t>
             </w:r>
             <w:proofErr w:type="spellEnd"/>
+            <w:r>
+              <w:rPr>
+                <w:color w:val="548DD4"/>
+                <w:sz w:val="20"/>
+                <w:szCs w:val="20"/>
+              </w:rPr>
+              <w:t xml:space="preserve"> VR es un proyecto de continuidad: existe una versión previa de </w:t>
+            </w:r>
+            <w:proofErr w:type="spellStart"/>
+            <w:r>
+              <w:rPr>
+                <w:color w:val="548DD4"/>
+                <w:sz w:val="20"/>
+                <w:szCs w:val="20"/>
+              </w:rPr>
+              <w:t>EmotionLAB</w:t>
+            </w:r>
+            <w:proofErr w:type="spellEnd"/>
+            <w:r>
+              <w:rPr>
+                <w:color w:val="548DD4"/>
+                <w:sz w:val="20"/>
+                <w:szCs w:val="20"/>
+              </w:rPr>
+              <w:t xml:space="preserve"> orientada a estudiantes de educación superior, y esta fase la reorienta a estudiantes de Enseñanza Media, incorporando gamificación en la experiencia. El proyecto aborda el déficit de gestión emocional que presentan los adolescentes frente a situaciones de alta exigencia, como una exposición oral o una entrevista. A ello se suma que el docente o psicopedagogo que acompaña el proceso no dispone de datos comportamentales que le permitan identificar quién necesita apoyo y en qué momento.</w:t>
+            </w:r>
           </w:p>
           <w:p>
             <w:pPr>
@@ -1564,12 +1590,6 @@
               </w:rPr>
               <w:t>Somos el equipo de desarrollo y diseño de la aplicación. Diseñamos e implementamos una experiencia inmersiva en Realidad Virtual que sitúa al estudiante en una situación de exposición o entrevista, incorporando un ejercicio de respiración guiada antes de exponer y un cierre gamificado de recolección de objetos en una sala acogedora. Somos además las encargadas de la telemetría: la captura de los datos comportamentales registrados durante el recorrido y su transmisión hacia la nube mediante API. La solución contempla una arquitectura de datos capaz de recepcionar, almacenar y limpiar la información capturada durante intervenciones realizadas dos veces por semana durante un mes. Finalmente, estos datos son transmitidos al equipo de IA de EmotionLab, encargado del modelo de clasificación y del dashboard analítico de Inteligencia de Negocios que apoya la toma de decisiones del docente o psicopedagogo.</w:t>
             </w:r>
-            <w:proofErr w:type="spellStart"/>
-            <w:proofErr w:type="spellEnd"/>
-            <w:proofErr w:type="spellStart"/>
-            <w:proofErr w:type="spellEnd"/>
-            <w:proofErr w:type="spellStart"/>
-            <w:proofErr w:type="spellEnd"/>
           </w:p>
         </w:tc>
       </w:tr>
@@ -1655,8 +1675,6 @@
               </w:rPr>
               <w:t>Análisis y Minería de Datos: Estructuración y preparación de los datos comportamentales capturados para su posterior análisis y clasificación por el equipo de IA.</w:t>
             </w:r>
-            <w:proofErr w:type="gramStart"/>
-            <w:proofErr w:type="gramEnd"/>
           </w:p>
           <w:p>
             <w:pPr>
@@ -1735,7 +1753,16 @@
                 <w:sz w:val="20"/>
                 <w:szCs w:val="20"/>
               </w:rPr>
-              <w:t>El proyecto se alinea con nuestros intereses en Ciencia de Datos, Ingeniería de Software y Gestión de Proyectos. Nos permite enfrentarnos a desafíos reales en el procesamiento de datos no estructurados o de series de tiempo generados por dispositivos inmersivos, fortaleciendo competencias en diseño de bases de datos, visualización analítica y liderazgo de proyectos tecnológicos aplicados al ámbito educativo.</w:t>
+              <w:t xml:space="preserve">El proyecto se alinea con nuestros intereses en Ciencia de Datos, Ingeniería de Software y Gestión de Proyectos. Nos permite enfrentarnos a desafíos reales en el procesamiento de datos no estructurados o de series de tiempo generados por dispositivos inmersivos, fortaleciendo competencias en diseño de bases de datos, </w:t>
+            </w:r>
+            <w:r>
+              <w:rPr>
+                <w:color w:val="548DD4"/>
+                <w:sz w:val="20"/>
+                <w:szCs w:val="20"/>
+              </w:rPr>
+              <w:lastRenderedPageBreak/>
+              <w:t>visualización analítica y liderazgo de proyectos tecnológicos aplicados al ámbito educativo.</w:t>
             </w:r>
           </w:p>
         </w:tc>
@@ -1759,6 +1786,7 @@
               <w:rPr>
                 <w:color w:val="1F3864"/>
               </w:rPr>
+              <w:lastRenderedPageBreak/>
               <w:t>Factibilidad de desarrollo del Proyecto APT</w:t>
             </w:r>
           </w:p>
@@ -1787,8 +1815,6 @@
               </w:rPr>
               <w:t>El proyecto es totalmente factible de ejecutar dentro del marco de 13 semanas (4 semanas de planificación/documentación y 9 semanas de desarrollo, pruebas de campo y cierre), dejando además un margen de 5 semanas dentro del periodo de 18 semanas del semestre académico. Al tratarse de un proyecto de continuidad, se parte desde una versión previa de EmotionLAB ya desarrollada, lo que reduce el riesgo técnico y permite concentrar el esfuerzo en el rediseño de la experiencia para Enseñanza Media y en la telemetría.</w:t>
             </w:r>
-            <w:proofErr w:type="gramStart"/>
-            <w:proofErr w:type="gramEnd"/>
           </w:p>
           <w:p>
             <w:pPr>
@@ -1846,7 +1872,6 @@
                 <w:sz w:val="20"/>
                 <w:szCs w:val="20"/>
               </w:rPr>
-              <w:lastRenderedPageBreak/>
               <w:t>Apoyo Institucional:</w:t>
             </w:r>
             <w:r>
@@ -2209,6 +2234,7 @@
                 <w:sz w:val="20"/>
                 <w:szCs w:val="20"/>
               </w:rPr>
+              <w:lastRenderedPageBreak/>
               <w:t>Ejecutar pruebas de campo coordinadas con el colegio participante, interviniendo un grupo mínimo de 20 estudiantes, 2 veces a la semana durante 1 mes.</w:t>
             </w:r>
           </w:p>
@@ -2412,7 +2438,6 @@
               <w:rPr>
                 <w:color w:val="1F3864"/>
               </w:rPr>
-              <w:lastRenderedPageBreak/>
               <w:t>Descripción de la Metodología</w:t>
             </w:r>
           </w:p>
@@ -2835,8 +2860,6 @@
               </w:rPr>
               <w:t>El stack de trabajo contempla Unity para el desarrollo de la experiencia inmersiva, visores Meta Quest como hardware objetivo, AWS con Lambda y Terraform para la infraestructura y la transmisión de datos en la nube, y GitHub junto a GitHub Projects para el versionamiento del código y la gestión del tablero Kanban.</w:t>
             </w:r>
-            <w:proofErr w:type="spellStart"/>
-            <w:proofErr w:type="spellEnd"/>
           </w:p>
         </w:tc>
       </w:tr>
@@ -2852,20 +2875,6 @@
           <w:szCs w:val="24"/>
         </w:rPr>
       </w:pPr>
-    </w:p>
-    <w:p>
-      <w:pPr>
-        <w:spacing w:after="0" w:line="240" w:lineRule="auto"/>
-        <w:rPr>
-          <w:b/>
-          <w:bCs/>
-          <w:sz w:val="24"/>
-          <w:szCs w:val="24"/>
-        </w:rPr>
-      </w:pPr>
-      <w:r>
-        <w:br w:type="page"/>
-      </w:r>
     </w:p>
     <w:tbl>
       <w:tblPr>
@@ -2906,6 +2915,10 @@
               </w:rPr>
             </w:pPr>
             <w:r>
+              <w:lastRenderedPageBreak/>
+              <w:br w:type="page"/>
+            </w:r>
+            <w:r>
               <w:rPr>
                 <w:b/>
                 <w:bCs/>
@@ -2913,7 +2926,6 @@
                 <w:sz w:val="28"/>
                 <w:szCs w:val="28"/>
               </w:rPr>
-              <w:lastRenderedPageBreak/>
               <w:t>6. Evidencias</w:t>
             </w:r>
           </w:p>
@@ -3998,8 +4010,6 @@
               </w:rPr>
               <w:t>Diseño de la experiencia VR</w:t>
             </w:r>
-            <w:proofErr w:type="spellStart"/>
-            <w:proofErr w:type="spellEnd"/>
           </w:p>
         </w:tc>
         <w:tc>
@@ -4145,8 +4155,6 @@
               </w:rPr>
               <w:t>Servicios en AWS operativos</w:t>
             </w:r>
-            <w:proofErr w:type="spellStart"/>
-            <w:proofErr w:type="spellEnd"/>
           </w:p>
         </w:tc>
         <w:tc>
@@ -4418,6 +4426,7 @@
                 <w:bCs/>
                 <w:color w:val="1F3864"/>
               </w:rPr>
+              <w:lastRenderedPageBreak/>
               <w:t>Final</w:t>
             </w:r>
           </w:p>
@@ -4705,7 +4714,6 @@
                 <w:bCs/>
                 <w:color w:val="1F3864"/>
               </w:rPr>
-              <w:lastRenderedPageBreak/>
               <w:t>Plan de Trabajo Proyecto APT</w:t>
             </w:r>
           </w:p>
@@ -5373,7 +5381,16 @@
                 <w:sz w:val="18"/>
                 <w:szCs w:val="18"/>
               </w:rPr>
-              <w:t xml:space="preserve">Diseñar y programar las escenas y mecánicas de interacción del entorno de Realidad Virtual en Unity, junto con la generación de </w:t>
+              <w:t xml:space="preserve">Diseñar y programar las escenas y mecánicas de interacción del entorno de Realidad Virtual en Unity, junto </w:t>
+            </w:r>
+            <w:r>
+              <w:rPr>
+                <w:color w:val="548DD4"/>
+                <w:sz w:val="18"/>
+                <w:szCs w:val="18"/>
+              </w:rPr>
+              <w:lastRenderedPageBreak/>
+              <w:t xml:space="preserve">con la generación de </w:t>
             </w:r>
             <w:proofErr w:type="spellStart"/>
             <w:r>
@@ -5416,6 +5433,7 @@
                 <w:sz w:val="18"/>
                 <w:szCs w:val="18"/>
               </w:rPr>
+              <w:lastRenderedPageBreak/>
               <w:t>Equipo computacional, Unity, visor VR</w:t>
             </w:r>
           </w:p>
@@ -5577,16 +5595,7 @@
                 <w:sz w:val="18"/>
                 <w:szCs w:val="18"/>
               </w:rPr>
-              <w:t xml:space="preserve">Diseñar la estructura de base de datos y los mecanismos de captura, almacenamiento y limpieza de los datos generados </w:t>
-            </w:r>
-            <w:r>
-              <w:rPr>
-                <w:color w:val="548DD4"/>
-                <w:sz w:val="18"/>
-                <w:szCs w:val="18"/>
-              </w:rPr>
-              <w:lastRenderedPageBreak/>
-              <w:t>durante las sesiones.</w:t>
+              <w:t>Diseñar la estructura de base de datos y los mecanismos de captura, almacenamiento y limpieza de los datos generados durante las sesiones.</w:t>
             </w:r>
           </w:p>
         </w:tc>
@@ -5611,7 +5620,6 @@
                 <w:sz w:val="18"/>
                 <w:szCs w:val="18"/>
               </w:rPr>
-              <w:lastRenderedPageBreak/>
               <w:t>Motor de base de datos, documentación técnica</w:t>
             </w:r>
           </w:p>
@@ -6517,7 +6525,16 @@
                 <w:sz w:val="18"/>
                 <w:szCs w:val="18"/>
               </w:rPr>
-              <w:t>Consolidar la documentación final, ensayar la presentación y realizar la defensa del proyecto ante el tribunal evaluador.</w:t>
+              <w:t xml:space="preserve">Consolidar la documentación final, ensayar la </w:t>
+            </w:r>
+            <w:r>
+              <w:rPr>
+                <w:color w:val="548DD4"/>
+                <w:sz w:val="18"/>
+                <w:szCs w:val="18"/>
+              </w:rPr>
+              <w:lastRenderedPageBreak/>
+              <w:t>presentación y realizar la defensa del proyecto ante el tribunal evaluador.</w:t>
             </w:r>
           </w:p>
         </w:tc>
@@ -6542,7 +6559,17 @@
                 <w:sz w:val="18"/>
                 <w:szCs w:val="18"/>
               </w:rPr>
-              <w:t>Documentación final, presentación, tribunal evaluador</w:t>
+              <w:lastRenderedPageBreak/>
+              <w:t xml:space="preserve">Documentación final, </w:t>
+            </w:r>
+            <w:r>
+              <w:rPr>
+                <w:color w:val="548DD4"/>
+                <w:sz w:val="18"/>
+                <w:szCs w:val="18"/>
+              </w:rPr>
+              <w:lastRenderedPageBreak/>
+              <w:t>presentación, tribunal evaluador</w:t>
             </w:r>
           </w:p>
         </w:tc>
@@ -6570,6 +6597,7 @@
                 <w:sz w:val="18"/>
                 <w:szCs w:val="18"/>
               </w:rPr>
+              <w:lastRenderedPageBreak/>
               <w:t>2 semanas</w:t>
             </w:r>
           </w:p>
@@ -6623,7 +6651,16 @@
                 <w:sz w:val="18"/>
                 <w:szCs w:val="18"/>
               </w:rPr>
-              <w:t>Requiere coordinar horarios del equipo para los ensayos grupales.</w:t>
+              <w:t xml:space="preserve">Requiere coordinar horarios </w:t>
+            </w:r>
+            <w:r>
+              <w:rPr>
+                <w:color w:val="548DD4"/>
+                <w:sz w:val="18"/>
+                <w:szCs w:val="18"/>
+              </w:rPr>
+              <w:lastRenderedPageBreak/>
+              <w:t>del equipo para los ensayos grupales.</w:t>
             </w:r>
           </w:p>
         </w:tc>
@@ -6725,14 +6762,7 @@
               <w:rPr>
                 <w:color w:val="1F3864"/>
               </w:rPr>
-              <w:t xml:space="preserve">Busca un formato de Carta Gantt que te acomode y organiza en este las actividades planificadas en el punto anterior considerando el periodo asignado para el desarrollo de tu Proyecto APT. Debes mantener </w:t>
-            </w:r>
-            <w:r>
-              <w:rPr>
-                <w:color w:val="1F3864"/>
-              </w:rPr>
-              <w:lastRenderedPageBreak/>
-              <w:t>la temporalidad del periodo académico en el desarrollo de las tres fases que contempla la Asignatura de Portafolio de Título.</w:t>
+              <w:t>Busca un formato de Carta Gantt que te acomode y organiza en este las actividades planificadas en el punto anterior considerando el periodo asignado para el desarrollo de tu Proyecto APT. Debes mantener la temporalidad del periodo académico en el desarrollo de las tres fases que contempla la Asignatura de Portafolio de Título.</w:t>
             </w:r>
           </w:p>
         </w:tc>
@@ -6939,6 +6969,7 @@
       <w:tr>
         <w:trPr>
           <w:gridAfter w:val="1"/>
+          <w:wAfter w:w="105" w:type="dxa"/>
           <w:trHeight w:val="303"/>
         </w:trPr>
         <w:tc>
@@ -7301,6 +7332,7 @@
       <w:tr>
         <w:trPr>
           <w:gridAfter w:val="1"/>
+          <w:wAfter w:w="105" w:type="dxa"/>
           <w:trHeight w:val="303"/>
         </w:trPr>
         <w:tc>
@@ -7558,6 +7590,7 @@
       <w:tr>
         <w:trPr>
           <w:gridAfter w:val="1"/>
+          <w:wAfter w:w="105" w:type="dxa"/>
           <w:trHeight w:val="294"/>
         </w:trPr>
         <w:tc>
@@ -7816,6 +7849,7 @@
       <w:tr>
         <w:trPr>
           <w:gridAfter w:val="1"/>
+          <w:wAfter w:w="105" w:type="dxa"/>
           <w:trHeight w:val="294"/>
         </w:trPr>
         <w:tc>
@@ -8073,6 +8107,7 @@
       <w:tr>
         <w:trPr>
           <w:gridAfter w:val="1"/>
+          <w:wAfter w:w="105" w:type="dxa"/>
           <w:trHeight w:val="294"/>
         </w:trPr>
         <w:tc>
@@ -8329,6 +8364,7 @@
       <w:tr>
         <w:trPr>
           <w:gridAfter w:val="1"/>
+          <w:wAfter w:w="105" w:type="dxa"/>
           <w:trHeight w:val="294"/>
         </w:trPr>
         <w:tc>
@@ -8584,6 +8620,7 @@
       <w:tr>
         <w:trPr>
           <w:gridAfter w:val="1"/>
+          <w:wAfter w:w="105" w:type="dxa"/>
           <w:trHeight w:val="294"/>
         </w:trPr>
         <w:tc>
@@ -8840,6 +8877,7 @@
       <w:tr>
         <w:trPr>
           <w:gridAfter w:val="1"/>
+          <w:wAfter w:w="105" w:type="dxa"/>
           <w:trHeight w:val="294"/>
         </w:trPr>
         <w:tc>
@@ -9095,6 +9133,7 @@
       <w:tr>
         <w:trPr>
           <w:gridAfter w:val="1"/>
+          <w:wAfter w:w="105" w:type="dxa"/>
           <w:trHeight w:val="294"/>
         </w:trPr>
         <w:tc>
@@ -9350,10 +9389,11 @@
     </w:tbl>
     <w:p>
       <w:pPr>
+        <w:spacing w:after="0" w:line="240" w:lineRule="auto"/>
         <w:rPr>
           <w:b/>
           <w:bCs/>
-          <w:sz w:val="24"/>
+          <w:sz w:val="2"/>
           <w:szCs w:val="24"/>
         </w:rPr>
       </w:pPr>
@@ -11683,6 +11723,28 @@
 </a:theme>
 </file>
 
+<file path=word/webextensions/taskpanes.xml><?xml version="1.0" encoding="utf-8"?>
+<wetp:taskpanes xmlns:wetp="http://schemas.microsoft.com/office/webextensions/taskpanes/2010/11">
+  <wetp:taskpane dockstate="right" visibility="0" width="350" row="0">
+    <wetp:webextensionref xmlns:r="http://schemas.openxmlformats.org/officeDocument/2006/relationships" r:id="rId1"/>
+  </wetp:taskpane>
+</wetp:taskpanes>
+</file>
+
+<file path=word/webextensions/webextension1.xml><?xml version="1.0" encoding="utf-8"?>
+<we:webextension xmlns:we="http://schemas.microsoft.com/office/webextensions/webextension/2010/11" id="{2DD1B48C-4B12-4E65-B035-5F44484B27B1}">
+  <we:reference id="wa200010453" version="1.0.0.1" store="en-US" storeType="OMEX"/>
+  <we:alternateReferences>
+    <we:reference id="WA200010453" version="1.0.0.1" store="" storeType="OMEX"/>
+  </we:alternateReferences>
+  <we:properties>
+    <we:property name="claude.fileId" value="&quot;a7291893-ab10-4ff3-b544-cb45f7ca4c2a&quot;"/>
+  </we:properties>
+  <we:bindings/>
+  <we:snapshot xmlns:r="http://schemas.openxmlformats.org/officeDocument/2006/relationships"/>
+</we:webextension>
+</file>
+
 <file path=customXml/item1.xml><?xml version="1.0" encoding="utf-8"?>
 <go:gDocsCustomXmlDataStorage xmlns:go="http://customooxmlschemas.google.com/" xmlns:r="http://schemas.openxmlformats.org/officeDocument/2006/relationships" uri="GoogleDocsCustomDataVersion2">
   <go:docsCustomData xmlns:go="http://customooxmlschemas.google.com/" roundtripDataSignature="AMtx7miYTgVjz5YVTMjnfgZqWmd11kmKrw==">CgMxLjAaHwoBMBIaChgICVIUChJ0YWJsZS5uYTdvNnVvaGZjZnc4AHIhMVJqbjdFLXhlcm9tc1JZejZLM3ZyR21pWkloV0NpM0VV</go:docsCustomData>

</xml_diff>